<commit_message>
Add Phase 1 project plan
</commit_message>
<xml_diff>
--- a/docs/Phase_1 2.docx
+++ b/docs/Phase_1 2.docx
@@ -609,15 +609,7 @@
         <w:pStyle w:val="NormalWeb"/>
       </w:pPr>
       <w:r>
-        <w:t xml:space="preserve">Every stakeholder would </w:t>
-      </w:r>
-      <w:proofErr w:type="gramStart"/>
-      <w:r>
-        <w:t>have interaction with</w:t>
-      </w:r>
-      <w:proofErr w:type="gramEnd"/>
-      <w:r>
-        <w:t xml:space="preserve"> the system in a manner that corresponds to their specific role.</w:t>
+        <w:t>Every stakeholder would have interaction with the system in a manner that corresponds to their specific role.</w:t>
       </w:r>
     </w:p>
     <w:p>
@@ -809,21 +801,7 @@
         <w:rPr>
           <w:rFonts w:asciiTheme="majorBidi" w:hAnsiTheme="majorBidi" w:cstheme="majorBidi"/>
         </w:rPr>
-        <w:t xml:space="preserve">The system will add value to this process in such a way that assets with surplus can be posted. Other departments can make a search of such assets and place a request. After the request has been reviewed and approved, the asset can be transferred. Maintenance, repair, donation, recycle and disposal will be managed </w:t>
-      </w:r>
-      <w:proofErr w:type="gramStart"/>
-      <w:r>
-        <w:rPr>
-          <w:rFonts w:asciiTheme="majorBidi" w:hAnsiTheme="majorBidi" w:cstheme="majorBidi"/>
-        </w:rPr>
-        <w:t>in order to</w:t>
-      </w:r>
-      <w:proofErr w:type="gramEnd"/>
-      <w:r>
-        <w:rPr>
-          <w:rFonts w:asciiTheme="majorBidi" w:hAnsiTheme="majorBidi" w:cstheme="majorBidi"/>
-        </w:rPr>
-        <w:t xml:space="preserve"> be able to follow up the whole life cycle of the asset.</w:t>
+        <w:t>The system will add value to this process in such a way that assets with surplus can be posted. Other departments can make a search of such assets and place a request. After the request has been reviewed and approved, the asset can be transferred. Maintenance, repair, donation, recycle and disposal will be managed in order to be able to follow up the whole life cycle of the asset.</w:t>
       </w:r>
     </w:p>
     <w:p>
@@ -886,15 +864,7 @@
           <w:b/>
           <w:bCs/>
         </w:rPr>
-        <w:t xml:space="preserve">9. </w:t>
-      </w:r>
-      <w:r>
-        <w:rPr>
-          <w:rFonts w:asciiTheme="majorBidi" w:hAnsiTheme="majorBidi" w:cstheme="majorBidi"/>
-          <w:b/>
-          <w:bCs/>
-        </w:rPr>
-        <w:t>Preliminary Project Plan</w:t>
+        <w:t>9. Preliminary Project Plan</w:t>
       </w:r>
     </w:p>
     <w:p>
@@ -913,10 +883,10 @@
     <w:p>
       <w:r>
         <w:drawing>
-          <wp:inline distT="0" distB="0" distL="0" distR="0" wp14:anchorId="4ADEFA85" wp14:editId="673DAB03">
-            <wp:extent cx="5887272" cy="1514686"/>
-            <wp:effectExtent l="0" t="0" r="0" b="9525"/>
-            <wp:docPr id="1532906806" name="Picture 1"/>
+          <wp:inline distT="0" distB="0" distL="0" distR="0" wp14:anchorId="40341018" wp14:editId="285A51C5">
+            <wp:extent cx="8058564" cy="2883048"/>
+            <wp:effectExtent l="0" t="0" r="0" b="0"/>
+            <wp:docPr id="997231617" name="Picture 1"/>
             <wp:cNvGraphicFramePr>
               <a:graphicFrameLocks xmlns:a="http://schemas.openxmlformats.org/drawingml/2006/main" noChangeAspect="1"/>
             </wp:cNvGraphicFramePr>
@@ -924,7 +894,7 @@
               <a:graphicData uri="http://schemas.openxmlformats.org/drawingml/2006/picture">
                 <pic:pic xmlns:pic="http://schemas.openxmlformats.org/drawingml/2006/picture">
                   <pic:nvPicPr>
-                    <pic:cNvPr id="1532906806" name=""/>
+                    <pic:cNvPr id="997231617" name=""/>
                     <pic:cNvPicPr/>
                   </pic:nvPicPr>
                   <pic:blipFill>
@@ -936,7 +906,7 @@
                   <pic:spPr>
                     <a:xfrm>
                       <a:off x="0" y="0"/>
-                      <a:ext cx="5887272" cy="1514686"/>
+                      <a:ext cx="8058564" cy="2883048"/>
                     </a:xfrm>
                     <a:prstGeom prst="rect">
                       <a:avLst/>
@@ -1035,21 +1005,7 @@
         <w:rPr>
           <w:rFonts w:asciiTheme="majorBidi" w:hAnsiTheme="majorBidi" w:cstheme="majorBidi"/>
         </w:rPr>
-        <w:t xml:space="preserve">For </w:t>
-      </w:r>
-      <w:proofErr w:type="gramStart"/>
-      <w:r>
-        <w:rPr>
-          <w:rFonts w:asciiTheme="majorBidi" w:hAnsiTheme="majorBidi" w:cstheme="majorBidi"/>
-        </w:rPr>
-        <w:t>example</w:t>
-      </w:r>
-      <w:proofErr w:type="gramEnd"/>
-      <w:r>
-        <w:rPr>
-          <w:rFonts w:asciiTheme="majorBidi" w:hAnsiTheme="majorBidi" w:cstheme="majorBidi"/>
-        </w:rPr>
-        <w:t xml:space="preserve"> development cannot start properly until the requirements and system design have been set.</w:t>
+        <w:t>For example development cannot start properly until the requirements and system design have been set.</w:t>
       </w:r>
     </w:p>
     <w:p>
@@ -2371,6 +2327,7 @@
   <w:style w:type="character" w:default="1" w:styleId="DefaultParagraphFont">
     <w:name w:val="Default Paragraph Font"/>
     <w:uiPriority w:val="1"/>
+    <w:semiHidden/>
     <w:unhideWhenUsed/>
   </w:style>
   <w:style w:type="table" w:default="1" w:styleId="TableNormal">

</xml_diff>